<commit_message>
docs(partner): prior root-cause deliverables + partner source materials
Adds the earlier-session analysis artifacts for provenance: the 36-agent
root-cause analysis report (md/pdf/docx, its mechanism since superseded by
the gap-analysis regeneration), the Pauwels-Vanhoutte interface-SRH scoping
note, the root-cause presentation assets, the partner's SCAPS input report
(1D-SCAPS simulation PDF) and parameter workbook (1R-Parameters.xlsx), and
the updated validation docx.

Confidence: high
Scope-risk: narrow
Directive: the root-cause report's base-V_oc mechanism is superseded by SolarLab_SCAPS_gap_analysis_corrected.md (effective-DOS terms); treat it as historical record
</commit_message>
<xml_diff>
--- a/docs/partner/SolarLab_SCAPS_validation_2026-05-29.docx
+++ b/docs/partner/SolarLab_SCAPS_validation_2026-05-29.docx
@@ -46,7 +46,7 @@
             <w:fldChar w:fldCharType="begin"/>
           </w:r>
           <w:r>
-            <w:instrText xml:space="preserve"> HYPERLINK \l _Toc1087761441 </w:instrText>
+            <w:instrText xml:space="preserve"> HYPERLINK \l _Toc1918693584 </w:instrText>
           </w:r>
           <w:r>
             <w:fldChar w:fldCharType="separate"/>
@@ -61,7 +61,7 @@
             <w:fldChar w:fldCharType="begin"/>
           </w:r>
           <w:r>
-            <w:instrText xml:space="preserve"> PAGEREF _Toc1087761441 \h </w:instrText>
+            <w:instrText xml:space="preserve"> PAGEREF _Toc1918693584 \h </w:instrText>
           </w:r>
           <w:r>
             <w:fldChar w:fldCharType="separate"/>
@@ -87,7 +87,7 @@
             <w:fldChar w:fldCharType="begin"/>
           </w:r>
           <w:r>
-            <w:instrText xml:space="preserve"> HYPERLINK \l _Toc478251976 </w:instrText>
+            <w:instrText xml:space="preserve"> HYPERLINK \l _Toc868622936 </w:instrText>
           </w:r>
           <w:r>
             <w:fldChar w:fldCharType="separate"/>
@@ -102,7 +102,7 @@
             <w:fldChar w:fldCharType="begin"/>
           </w:r>
           <w:r>
-            <w:instrText xml:space="preserve"> PAGEREF _Toc478251976 \h </w:instrText>
+            <w:instrText xml:space="preserve"> PAGEREF _Toc868622936 \h </w:instrText>
           </w:r>
           <w:r>
             <w:fldChar w:fldCharType="separate"/>
@@ -128,7 +128,7 @@
             <w:fldChar w:fldCharType="begin"/>
           </w:r>
           <w:r>
-            <w:instrText xml:space="preserve"> HYPERLINK \l _Toc2097153558 </w:instrText>
+            <w:instrText xml:space="preserve"> HYPERLINK \l _Toc351853046 </w:instrText>
           </w:r>
           <w:r>
             <w:fldChar w:fldCharType="separate"/>
@@ -143,7 +143,7 @@
             <w:fldChar w:fldCharType="begin"/>
           </w:r>
           <w:r>
-            <w:instrText xml:space="preserve"> PAGEREF _Toc2097153558 \h </w:instrText>
+            <w:instrText xml:space="preserve"> PAGEREF _Toc351853046 \h </w:instrText>
           </w:r>
           <w:r>
             <w:fldChar w:fldCharType="separate"/>
@@ -169,7 +169,7 @@
             <w:fldChar w:fldCharType="begin"/>
           </w:r>
           <w:r>
-            <w:instrText xml:space="preserve"> HYPERLINK \l _Toc210751095 </w:instrText>
+            <w:instrText xml:space="preserve"> HYPERLINK \l _Toc1571663931 </w:instrText>
           </w:r>
           <w:r>
             <w:fldChar w:fldCharType="separate"/>
@@ -184,7 +184,7 @@
             <w:fldChar w:fldCharType="begin"/>
           </w:r>
           <w:r>
-            <w:instrText xml:space="preserve"> PAGEREF _Toc210751095 \h </w:instrText>
+            <w:instrText xml:space="preserve"> PAGEREF _Toc1571663931 \h </w:instrText>
           </w:r>
           <w:r>
             <w:fldChar w:fldCharType="separate"/>
@@ -210,7 +210,7 @@
             <w:fldChar w:fldCharType="begin"/>
           </w:r>
           <w:r>
-            <w:instrText xml:space="preserve"> HYPERLINK \l _Toc893119762 </w:instrText>
+            <w:instrText xml:space="preserve"> HYPERLINK \l _Toc906830217 </w:instrText>
           </w:r>
           <w:r>
             <w:fldChar w:fldCharType="separate"/>
@@ -225,7 +225,7 @@
             <w:fldChar w:fldCharType="begin"/>
           </w:r>
           <w:r>
-            <w:instrText xml:space="preserve"> PAGEREF _Toc893119762 \h </w:instrText>
+            <w:instrText xml:space="preserve"> PAGEREF _Toc906830217 \h </w:instrText>
           </w:r>
           <w:r>
             <w:fldChar w:fldCharType="separate"/>
@@ -251,7 +251,7 @@
             <w:fldChar w:fldCharType="begin"/>
           </w:r>
           <w:r>
-            <w:instrText xml:space="preserve"> HYPERLINK \l _Toc1900631051 </w:instrText>
+            <w:instrText xml:space="preserve"> HYPERLINK \l _Toc404014360 </w:instrText>
           </w:r>
           <w:r>
             <w:fldChar w:fldCharType="separate"/>
@@ -266,7 +266,7 @@
             <w:fldChar w:fldCharType="begin"/>
           </w:r>
           <w:r>
-            <w:instrText xml:space="preserve"> PAGEREF _Toc1900631051 \h </w:instrText>
+            <w:instrText xml:space="preserve"> PAGEREF _Toc404014360 \h </w:instrText>
           </w:r>
           <w:r>
             <w:fldChar w:fldCharType="separate"/>
@@ -292,7 +292,7 @@
             <w:fldChar w:fldCharType="begin"/>
           </w:r>
           <w:r>
-            <w:instrText xml:space="preserve"> HYPERLINK \l _Toc86825032 </w:instrText>
+            <w:instrText xml:space="preserve"> HYPERLINK \l _Toc2073540353 </w:instrText>
           </w:r>
           <w:r>
             <w:fldChar w:fldCharType="separate"/>
@@ -307,7 +307,7 @@
             <w:fldChar w:fldCharType="begin"/>
           </w:r>
           <w:r>
-            <w:instrText xml:space="preserve"> PAGEREF _Toc86825032 \h </w:instrText>
+            <w:instrText xml:space="preserve"> PAGEREF _Toc2073540353 \h </w:instrText>
           </w:r>
           <w:r>
             <w:fldChar w:fldCharType="separate"/>
@@ -337,7 +337,7 @@
         <w:pStyle w:val="2"/>
         <w:jc w:val="both"/>
       </w:pPr>
-      <w:bookmarkStart w:id="0" w:name="_Toc1087761441"/>
+      <w:bookmarkStart w:id="0" w:name="_Toc1918693584"/>
       <w:bookmarkStart w:id="1" w:name="summary"/>
       <w:r>
         <w:t>Summary</w:t>
@@ -390,7 +390,64 @@
         <w:t xml:space="preserve">SCAPS-1D test </w:t>
       </w:r>
       <w:r>
-        <w:t xml:space="preserve">workbook. At the operating point, SolarLab reproduces the short-circuit current density to within 2 % and the fill factor to within 1.4 percentage points of SCAPS, while the open-circuit voltage is 96 mV lower. Across the eleven sweeps, seven match SCAPS in both direction and shape, two match partially, and two remain open. Every SolarLab result satisfies the governing physical bounds — the short-circuit current stays below the Shockley–Queisser limit, the open-circuit voltage below the built-in potential, and recombination remains non-negative throughout. The three residual discrepancies are not parameter-fitting errors; each traces to a specific, physically understood difference between the two solvers. </w:t>
+        <w:t>workbook. At the operating point, SolarLab reproduces the short-circuit current density to within 2% and the fill factor to within 1.4</w:t>
+      </w:r>
+      <w:r>
+        <w:rPr>
+          <w:rFonts w:hint="eastAsia"/>
+          <w:lang w:val="en-US" w:eastAsia="zh-CN"/>
+        </w:rPr>
+        <w:t>%</w:t>
+      </w:r>
+      <w:r>
+        <w:t xml:space="preserve"> of SCAPS, while the open-circuit voltage is 96 mV lower. Across the </w:t>
+      </w:r>
+      <w:r>
+        <w:rPr>
+          <w:rFonts w:hint="default"/>
+          <w:lang w:val="en-US"/>
+        </w:rPr>
+        <w:t>11</w:t>
+      </w:r>
+      <w:r>
+        <w:rPr>
+          <w:rFonts w:hint="eastAsia"/>
+          <w:lang w:val="en-US" w:eastAsia="zh-CN"/>
+        </w:rPr>
+        <w:t xml:space="preserve"> </w:t>
+      </w:r>
+      <w:r>
+        <w:t xml:space="preserve">sweeps, </w:t>
+      </w:r>
+      <w:r>
+        <w:rPr>
+          <w:rFonts w:hint="eastAsia"/>
+          <w:lang w:val="en-US" w:eastAsia="zh-CN"/>
+        </w:rPr>
+        <w:t xml:space="preserve">7 </w:t>
+      </w:r>
+      <w:r>
+        <w:t xml:space="preserve">match SCAPS in both direction and shape, </w:t>
+      </w:r>
+      <w:r>
+        <w:rPr>
+          <w:rFonts w:hint="eastAsia"/>
+          <w:lang w:val="en-US" w:eastAsia="zh-CN"/>
+        </w:rPr>
+        <w:t xml:space="preserve">2 </w:t>
+      </w:r>
+      <w:r>
+        <w:t xml:space="preserve">match partially, and </w:t>
+      </w:r>
+      <w:r>
+        <w:rPr>
+          <w:rFonts w:hint="eastAsia"/>
+          <w:lang w:val="en-US" w:eastAsia="zh-CN"/>
+        </w:rPr>
+        <w:t xml:space="preserve">2 </w:t>
+      </w:r>
+      <w:r>
+        <w:t>remain open. Every SolarLab result satisfies the governing physical bounds — the short-circuit current stays below the Shockley–Queisser limit, the open-circuit voltage below the built-in potential, and recombination remains non-negative throughout.</w:t>
       </w:r>
     </w:p>
     <w:bookmarkEnd w:id="1"/>
@@ -399,7 +456,7 @@
         <w:pStyle w:val="2"/>
         <w:jc w:val="both"/>
       </w:pPr>
-      <w:bookmarkStart w:id="2" w:name="_Toc478251976"/>
+      <w:bookmarkStart w:id="2" w:name="_Toc868622936"/>
       <w:bookmarkStart w:id="3" w:name="introduction"/>
       <w:r>
         <w:t>1. Introduction</w:t>
@@ -441,7 +498,7 @@
         <w:jc w:val="both"/>
       </w:pPr>
       <w:r>
-        <w:t xml:space="preserve">The validation device is the partner </w:t>
+        <w:t xml:space="preserve">The validation device is the </w:t>
       </w:r>
       <w:r>
         <w:rPr>
@@ -526,7 +583,7 @@
         <w:pStyle w:val="2"/>
         <w:jc w:val="both"/>
       </w:pPr>
-      <w:bookmarkStart w:id="4" w:name="_Toc2097153558"/>
+      <w:bookmarkStart w:id="4" w:name="_Toc351853046"/>
       <w:bookmarkStart w:id="5" w:name="methodology"/>
       <w:r>
         <w:t>2. Methodology</w:t>
@@ -568,7 +625,17 @@
         <w:t>scaps_mirror_v2.yaml</w:t>
       </w:r>
       <w:r>
-        <w:t xml:space="preserve"> device definition, which encodes the partner layer stack, doping, mobilities, defect levels, and optical constants, and adds a glass front substrate so that the optical stack is complete. Each of the eleven single-variable sweeps varies one physical parameter across the range tabulated in the workbook while holding all others fixed, and the resulting </w:t>
+        <w:t xml:space="preserve"> device definition, which encodes the partner layer stack, doping, mobilities, defect levels, and optical constants, and adds a glass front substrate so that the optical stack is complete. Each of the </w:t>
+      </w:r>
+      <w:r>
+        <w:rPr>
+          <w:rFonts w:hint="eastAsia"/>
+          <w:lang w:val="en-US" w:eastAsia="zh-CN"/>
+        </w:rPr>
+        <w:t xml:space="preserve">11 </w:t>
+      </w:r>
+      <w:r>
+        <w:t xml:space="preserve">single-variable sweeps varies one physical parameter across the range tabulated in the workbook while holding all others fixed, and the resulting </w:t>
       </w:r>
       <w:r>
         <w:rPr>
@@ -642,7 +709,7 @@
         <w:pStyle w:val="2"/>
         <w:jc w:val="both"/>
       </w:pPr>
-      <w:bookmarkStart w:id="6" w:name="_Toc210751095"/>
+      <w:bookmarkStart w:id="6" w:name="_Toc1571663931"/>
       <w:bookmarkStart w:id="7" w:name="base-operating-point"/>
       <w:r>
         <w:t>3. Base operating point</w:t>
@@ -782,7 +849,14 @@
               <w:jc w:val="both"/>
             </w:pPr>
             <w:r>
-              <w:t>−96 mV</w:t>
+              <w:rPr>
+                <w:rFonts w:hint="eastAsia"/>
+                <w:lang w:val="en-US" w:eastAsia="zh-CN"/>
+              </w:rPr>
+              <w:t>-</w:t>
+            </w:r>
+            <w:r>
+              <w:t>96 mV</w:t>
             </w:r>
           </w:p>
         </w:tc>
@@ -846,7 +920,14 @@
               <w:jc w:val="both"/>
             </w:pPr>
             <w:r>
-              <w:t>−2 %</w:t>
+              <w:rPr>
+                <w:rFonts w:hint="eastAsia"/>
+                <w:lang w:val="en-US" w:eastAsia="zh-CN"/>
+              </w:rPr>
+              <w:t>-</w:t>
+            </w:r>
+            <w:r>
+              <w:t>2%</w:t>
             </w:r>
           </w:p>
         </w:tc>
@@ -890,9 +971,27 @@
             <w:pPr>
               <w:pStyle w:val="25"/>
               <w:jc w:val="both"/>
-            </w:pPr>
-            <w:r>
-              <w:t>−1.4 pp</w:t>
+              <w:rPr>
+                <w:rFonts w:hint="eastAsia" w:eastAsiaTheme="minorHAnsi"/>
+                <w:lang w:val="en-US" w:eastAsia="zh-CN"/>
+              </w:rPr>
+            </w:pPr>
+            <w:r>
+              <w:rPr>
+                <w:rFonts w:hint="eastAsia"/>
+                <w:lang w:val="en-US" w:eastAsia="zh-CN"/>
+              </w:rPr>
+              <w:t>-</w:t>
+            </w:r>
+            <w:r>
+              <w:t>1.4</w:t>
+            </w:r>
+            <w:r>
+              <w:rPr>
+                <w:rFonts w:hint="eastAsia"/>
+                <w:lang w:val="en-US" w:eastAsia="zh-CN"/>
+              </w:rPr>
+              <w:t>%</w:t>
             </w:r>
           </w:p>
         </w:tc>
@@ -936,9 +1035,27 @@
             <w:pPr>
               <w:pStyle w:val="25"/>
               <w:jc w:val="both"/>
-            </w:pPr>
-            <w:r>
-              <w:t>−4.6 pp</w:t>
+              <w:rPr>
+                <w:rFonts w:hint="eastAsia" w:eastAsiaTheme="minorHAnsi"/>
+                <w:lang w:val="en-US" w:eastAsia="zh-CN"/>
+              </w:rPr>
+            </w:pPr>
+            <w:r>
+              <w:rPr>
+                <w:rFonts w:hint="eastAsia"/>
+                <w:lang w:val="en-US" w:eastAsia="zh-CN"/>
+              </w:rPr>
+              <w:t>-</w:t>
+            </w:r>
+            <w:r>
+              <w:t>4.6</w:t>
+            </w:r>
+            <w:r>
+              <w:rPr>
+                <w:rFonts w:hint="eastAsia"/>
+                <w:lang w:val="en-US" w:eastAsia="zh-CN"/>
+              </w:rPr>
+              <w:t>%</w:t>
             </w:r>
           </w:p>
         </w:tc>
@@ -979,7 +1096,17 @@
         <w:jc w:val="both"/>
       </w:pPr>
       <w:r>
-        <w:t>The short-circuit current is now physical and within 2 % of SCAPS, a direct consequence of completing the optical stack with the glass front substrate; the small residual is front-surface reflection that SolarLab retains and SCAPS idealizes away (Section 5). The fill factor agrees to within 1.4 percentage points. The open-circuit voltage is the single dominant discrepancy: its 96 mV shortfall propagates through the V</w:t>
+        <w:t>The short-circuit current is now physical and within 2% of SCAPS, a direct consequence of completing the optical stack with the glass front substrate; the small residual is front-surface reflection that SolarLab retains and SCAPS idealizes away (Section 5). The fill factor agrees to within 1.4</w:t>
+      </w:r>
+      <w:r>
+        <w:rPr>
+          <w:rFonts w:hint="default"/>
+          <w:lang w:val="en-US"/>
+        </w:rPr>
+        <w:t>%</w:t>
+      </w:r>
+      <w:r>
+        <w:t>. The open-circuit voltage is the single dominant discrepancy: its 96 mV shortfall propagates through the V</w:t>
       </w:r>
       <w:r>
         <w:rPr>
@@ -997,7 +1124,7 @@
         <w:pStyle w:val="2"/>
         <w:jc w:val="both"/>
       </w:pPr>
-      <w:bookmarkStart w:id="8" w:name="_Toc893119762"/>
+      <w:bookmarkStart w:id="8" w:name="_Toc906830217"/>
       <w:bookmarkStart w:id="9" w:name="sweep-by-sweep-comparison"/>
       <w:r>
         <w:t>4. Sweep-by-sweep comparison</w:t>
@@ -1030,7 +1157,14 @@
         <w:t>black</w:t>
       </w:r>
       <w:r>
-        <w:t xml:space="preserve">), with all four </w:t>
+        <w:t xml:space="preserve">), with all </w:t>
+      </w:r>
+      <w:r>
+        <w:rPr>
+          <w:rFonts w:hint="eastAsia"/>
+          <w:lang w:val="en-US" w:eastAsia="zh-CN"/>
+        </w:rPr>
+        <w:t xml:space="preserve">4 </w:t>
       </w:r>
       <w:r>
         <w:rPr>
@@ -1039,7 +1173,17 @@
         <w:t>figures</w:t>
       </w:r>
       <w:r>
-        <w:t xml:space="preserve"> per panel. Grouped by outcome, the results fall into three categories.</w:t>
+        <w:t xml:space="preserve"> per panel. Grouped by outcome, the results fall into </w:t>
+      </w:r>
+      <w:r>
+        <w:rPr>
+          <w:rFonts w:hint="eastAsia"/>
+          <w:lang w:val="en-US" w:eastAsia="zh-CN"/>
+        </w:rPr>
+        <w:t xml:space="preserve">3 </w:t>
+      </w:r>
+      <w:r>
+        <w:t>categories.</w:t>
       </w:r>
     </w:p>
     <w:p>
@@ -1073,7 +1217,7 @@
         <w:t>oc</w:t>
       </w:r>
       <w:r>
-        <w:t xml:space="preserve"> spike toward 1.08 V, with the direction and cliff slope both matched. The PVK/ETL interface defect-density and defect-level sweeps (Figures 2 and 3) match in direction and saturating shape, the defect-density response spanning roughly 75 % of the SCAPS V</w:t>
+        <w:t xml:space="preserve"> spike toward 1.08 V, with the direction and cliff slope both matched. The PVK/ETL interface defect-density and defect-level sweeps (Figures 2 and 3) match in direction and saturating shape, the defect-density response spanning roughly 75% of the SCAPS V</w:t>
       </w:r>
       <w:r>
         <w:rPr>
@@ -1186,7 +1330,27 @@
         <w:t>Open (two sweeps).</w:t>
       </w:r>
       <w:r>
-        <w:t xml:space="preserve"> The perovskite-bulk conduction- and valence-band defect-density sweeps (Figures 6 and 7) are flat in SolarLab, whereas SCAPS shows a small response (−39 mV and −11 mV respectively). The mechanism is explained in Section 5.</w:t>
+        <w:t xml:space="preserve"> The perovskite-bulk conduction- and valence-band defect-density sweeps (Figures 6 and 7) are flat in SolarLab, whereas SCAPS shows a small response (</w:t>
+      </w:r>
+      <w:r>
+        <w:rPr>
+          <w:rFonts w:hint="eastAsia"/>
+          <w:lang w:val="en-US" w:eastAsia="zh-CN"/>
+        </w:rPr>
+        <w:t>-</w:t>
+      </w:r>
+      <w:r>
+        <w:t xml:space="preserve">39 mV and </w:t>
+      </w:r>
+      <w:r>
+        <w:rPr>
+          <w:rFonts w:hint="eastAsia"/>
+          <w:lang w:val="en-US" w:eastAsia="zh-CN"/>
+        </w:rPr>
+        <w:t>-</w:t>
+      </w:r>
+      <w:r>
+        <w:t>11 mV respectively). The mechanism is explained in Section 5.</w:t>
       </w:r>
     </w:p>
     <w:p>
@@ -2134,7 +2298,7 @@
               <w:jc w:val="both"/>
             </w:pPr>
             <w:r>
-              <w:t>1.08 → 0.87 V (≈ 75 % of SCAPS range)</w:t>
+              <w:t>1.08 → 0.87 V (≈ 75% of SCAPS range)</w:t>
             </w:r>
           </w:p>
         </w:tc>
@@ -2455,9 +2619,30 @@
       <w:pPr>
         <w:pStyle w:val="3"/>
         <w:jc w:val="center"/>
-      </w:pPr>
-      <w:r>
-        <w:t>Table 2. Per-sweep</w:t>
+        <w:rPr>
+          <w:rFonts w:hint="default" w:eastAsiaTheme="minorHAnsi"/>
+          <w:lang w:val="en-US" w:eastAsia="zh-CN"/>
+        </w:rPr>
+      </w:pPr>
+      <w:r>
+        <w:t xml:space="preserve">Table 2. </w:t>
+      </w:r>
+      <w:r>
+        <w:rPr>
+          <w:rFonts w:hint="default"/>
+          <w:lang w:val="en-US"/>
+        </w:rPr>
+        <w:t>S</w:t>
+      </w:r>
+      <w:r>
+        <w:t>weep</w:t>
+      </w:r>
+      <w:r>
+        <w:rPr>
+          <w:rFonts w:hint="eastAsia"/>
+          <w:lang w:val="en-US" w:eastAsia="zh-CN"/>
+        </w:rPr>
+        <w:t xml:space="preserve"> outcomes</w:t>
       </w:r>
     </w:p>
     <w:bookmarkEnd w:id="9"/>
@@ -2466,7 +2651,7 @@
         <w:pStyle w:val="2"/>
         <w:jc w:val="both"/>
       </w:pPr>
-      <w:bookmarkStart w:id="10" w:name="_Toc1900631051"/>
+      <w:bookmarkStart w:id="10" w:name="_Toc404014360"/>
       <w:bookmarkStart w:id="11" w:name="analysis-of-the-current-situation"/>
       <w:r>
         <w:t>5. Analysis of the current situation</w:t>
@@ -2683,10 +2868,10 @@
           <w:b/>
           <w:bCs/>
         </w:rPr>
-        <w:t>Short-circuit current residual (−2 %).</w:t>
-      </w:r>
-      <w:r>
-        <w:t xml:space="preserve"> The remaining 2 % of J</w:t>
+        <w:t>Short-circuit current residual (−2%).</w:t>
+      </w:r>
+      <w:r>
+        <w:t xml:space="preserve"> The remaining 2% of J</w:t>
       </w:r>
       <w:r>
         <w:rPr>
@@ -2713,7 +2898,7 @@
         <w:pStyle w:val="2"/>
         <w:jc w:val="both"/>
       </w:pPr>
-      <w:bookmarkStart w:id="12" w:name="_Toc86825032"/>
+      <w:bookmarkStart w:id="12" w:name="_Toc2073540353"/>
       <w:bookmarkStart w:id="13" w:name="conclusion-and-outlook"/>
       <w:r>
         <w:t>6. Conclusion and outlook</w:t>
@@ -2724,16 +2909,20 @@
       <w:pPr>
         <w:pStyle w:val="24"/>
         <w:jc w:val="both"/>
-      </w:pPr>
-      <w:r>
-        <w:t xml:space="preserve">SolarLab reproduces the SCAPS-1D reference on the partner </w:t>
+        <w:rPr>
+          <w:rFonts w:hint="default" w:eastAsiaTheme="minorHAnsi"/>
+          <w:lang w:val="en-US" w:eastAsia="zh-CN"/>
+        </w:rPr>
+      </w:pPr>
+      <w:r>
+        <w:t>SolarLab reproduces the SCAPS-1D reference on the</w:t>
       </w:r>
       <w:r>
         <w:rPr>
           <w:rFonts w:hint="eastAsia"/>
           <w:lang w:val="en-US" w:eastAsia="zh-CN"/>
         </w:rPr>
-        <w:t>b</w:t>
+        <w:t xml:space="preserve"> b</w:t>
       </w:r>
       <w:r>
         <w:t xml:space="preserve">ase </w:t>
@@ -2746,7 +2935,47 @@
         <w:t>m</w:t>
       </w:r>
       <w:r>
-        <w:t xml:space="preserve">odel to a degree appropriate for a validated device simulator: short-circuit current within −2 %, fill factor within −1.4 percentage points, and seven of eleven parameter-sweep trends matched in direction and shape, with every result satisfying the physical bounds. The remaining discrepancies are characterized rather than incidental — </w:t>
+        <w:t xml:space="preserve">odel to a degree appropriate for a validated device simulator: short-circuit current within </w:t>
+      </w:r>
+      <w:r>
+        <w:rPr>
+          <w:rFonts w:hint="eastAsia"/>
+          <w:lang w:val="en-US" w:eastAsia="zh-CN"/>
+        </w:rPr>
+        <w:t>-</w:t>
+      </w:r>
+      <w:r>
+        <w:t xml:space="preserve">2%, fill factor within </w:t>
+      </w:r>
+      <w:r>
+        <w:rPr>
+          <w:rFonts w:hint="eastAsia"/>
+          <w:lang w:val="en-US" w:eastAsia="zh-CN"/>
+        </w:rPr>
+        <w:t>-</w:t>
+      </w:r>
+      <w:r>
+        <w:t>1.4</w:t>
+      </w:r>
+      <w:r>
+        <w:rPr>
+          <w:rFonts w:hint="eastAsia"/>
+          <w:lang w:val="en-US" w:eastAsia="zh-CN"/>
+        </w:rPr>
+        <w:t>%</w:t>
+      </w:r>
+      <w:r>
+        <w:t xml:space="preserve">, and </w:t>
+      </w:r>
+      <w:r>
+        <w:rPr>
+          <w:rFonts w:hint="eastAsia"/>
+          <w:lang w:val="en-US" w:eastAsia="zh-CN"/>
+        </w:rPr>
+        <w:t>7/11</w:t>
+      </w:r>
+      <w:r>
+        <w:t xml:space="preserve"> parameter-sweep trends matched in direction and shape, with every result satisfying the physical bounds. The remaining discrepancies are characterized rather than incidental — </w:t>
       </w:r>
       <w:r>
         <w:rPr>
@@ -2767,28 +2996,15 @@
         <w:t>heterojunction-transpor</w:t>
       </w:r>
       <w:r>
-        <w:t xml:space="preserve">t and </w:t>
-      </w:r>
-      <w:r>
         <w:rPr>
           <w:b/>
           <w:bCs/>
           <w:color w:val="C00000"/>
         </w:rPr>
-        <w:t>carrier-statistics difference</w:t>
-      </w:r>
-      <w:r>
-        <w:t xml:space="preserve">; the </w:t>
-      </w:r>
-      <w:r>
-        <w:rPr>
-          <w:b/>
-          <w:bCs/>
-        </w:rPr>
-        <w:t>donor-doping divergences</w:t>
-      </w:r>
-      <w:r>
-        <w:t xml:space="preserve"> are </w:t>
+        <w:t>t</w:t>
+      </w:r>
+      <w:r>
+        <w:t xml:space="preserve"> and </w:t>
       </w:r>
       <w:r>
         <w:rPr>
@@ -2796,10 +3012,20 @@
           <w:bCs/>
           <w:color w:val="C00000"/>
         </w:rPr>
-        <w:t>contact / built-in-potential</w:t>
-      </w:r>
-      <w:r>
-        <w:t xml:space="preserve"> and </w:t>
+        <w:t>carrier-statistics difference</w:t>
+      </w:r>
+      <w:r>
+        <w:t xml:space="preserve">; the </w:t>
+      </w:r>
+      <w:r>
+        <w:rPr>
+          <w:b/>
+          <w:bCs/>
+        </w:rPr>
+        <w:t>donor-doping divergences</w:t>
+      </w:r>
+      <w:r>
+        <w:t xml:space="preserve"> are </w:t>
       </w:r>
       <w:r>
         <w:rPr>
@@ -2807,20 +3033,10 @@
           <w:bCs/>
           <w:color w:val="C00000"/>
         </w:rPr>
-        <w:t>high-injection physics</w:t>
-      </w:r>
-      <w:r>
-        <w:t xml:space="preserve">; the </w:t>
-      </w:r>
-      <w:r>
-        <w:rPr>
-          <w:b/>
-          <w:bCs/>
-        </w:rPr>
-        <w:t>bulk-defect insensitivity</w:t>
-      </w:r>
-      <w:r>
-        <w:t xml:space="preserve"> is the i</w:t>
+        <w:t>contact / built-in-potential</w:t>
+      </w:r>
+      <w:r>
+        <w:t xml:space="preserve"> and </w:t>
       </w:r>
       <w:r>
         <w:rPr>
@@ -2828,40 +3044,20 @@
           <w:bCs/>
           <w:color w:val="C00000"/>
         </w:rPr>
-        <w:t>nterface-recombination ceiling.</w:t>
-      </w:r>
-      <w:r>
-        <w:t xml:space="preserve"> Each has been isolated, and in each case the SolarLab choice is the physically defensible one.</w:t>
-      </w:r>
-    </w:p>
-    <w:p>
-      <w:pPr>
-        <w:pStyle w:val="3"/>
-        <w:jc w:val="both"/>
-        <w:rPr>
-          <w:rFonts w:hint="default" w:eastAsiaTheme="minorHAnsi"/>
-          <w:lang w:val="en-US" w:eastAsia="zh-CN"/>
-        </w:rPr>
-      </w:pPr>
-      <w:r>
-        <w:t xml:space="preserve">Closing the remaining gaps would require reconciling solver-internal differences in heterojunction transport and high-injection carrier statistics, which is a substantial undertaking and is not pursued here because it would not improve — and could degrade — the physical fidelity that the present configuration guarantees. </w:t>
-      </w:r>
-      <w:r>
-        <w:rPr>
-          <w:rFonts w:hint="default"/>
-          <w:lang w:val="en-US"/>
-        </w:rPr>
-        <w:t>The</w:t>
-      </w:r>
-      <w:r>
-        <w:t xml:space="preserve"> </w:t>
-      </w:r>
-      <w:r>
-        <w:rPr>
-          <w:rFonts w:hint="default"/>
-          <w:lang w:val="en-US"/>
-        </w:rPr>
-        <w:t xml:space="preserve">situation </w:t>
+        <w:t>high-injection physics</w:t>
+      </w:r>
+      <w:r>
+        <w:t xml:space="preserve">; the </w:t>
+      </w:r>
+      <w:r>
+        <w:rPr>
+          <w:b/>
+          <w:bCs/>
+        </w:rPr>
+        <w:t>bulk-defect insensitivity</w:t>
+      </w:r>
+      <w:r>
+        <w:t xml:space="preserve"> is the </w:t>
       </w:r>
       <w:r>
         <w:rPr>
@@ -2869,32 +3065,21 @@
           <w:bCs/>
           <w:color w:val="C00000"/>
         </w:rPr>
-        <w:t>(glass front substrate with the non-generative interface clamp enabled by default)</w:t>
-      </w:r>
-      <w:r>
-        <w:t xml:space="preserve"> </w:t>
-      </w:r>
-      <w:r>
-        <w:rPr>
-          <w:rFonts w:hint="default"/>
-          <w:lang w:val="en-US"/>
-        </w:rPr>
-        <w:t xml:space="preserve">is configured </w:t>
-      </w:r>
-      <w:r>
-        <w:t>as the validated baseline</w:t>
+        <w:t>i</w:t>
+      </w:r>
+      <w:r>
+        <w:rPr>
+          <w:b/>
+          <w:bCs/>
+          <w:color w:val="C00000"/>
+        </w:rPr>
+        <w:t>nterface-recombination ceiling.</w:t>
+      </w:r>
+      <w:r>
+        <w:t xml:space="preserve"> Each has been isolated, and in each case the SolarLab choice is the physically defensible one.</w:t>
       </w:r>
       <w:bookmarkEnd w:id="13"/>
       <w:bookmarkStart w:id="14" w:name="appendix-reproducibility"/>
-      <w:r>
-        <w:rPr>
-          <w:rFonts w:hint="default"/>
-          <w:lang w:val="en-US"/>
-        </w:rPr>
-        <w:t xml:space="preserve"> currently.</w:t>
-      </w:r>
-      <w:bookmarkStart w:id="15" w:name="_GoBack"/>
-      <w:bookmarkEnd w:id="15"/>
     </w:p>
     <w:bookmarkEnd w:id="14"/>
     <w:sectPr>
@@ -3604,7 +3789,6 @@
       </w:tblCellMar>
     </w:tblPr>
     <w:tblStylePr w:type="firstRow">
-      <w:tblPr/>
       <w:tcPr>
         <w:tcBorders>
           <w:bottom w:val="single" w:color="auto" w:sz="0" w:space="0"/>

</xml_diff>